<commit_message>
Complete semantic RAG with ChatGPT member sign-in and local embeddings
Add persistent dense vectors, grounded multi-turn generation, per-claim quote validation, honest fallback states, and isolated OAuth credentials. Keep explicit local mode free of model calls even when old API settings remain.

Update VS Code setup and the 10-page V1.2 course report. Validate 77 regression tests, 14 boundary checks, 11 real ChatGPT/Ollama checks, and 13 browser checks separately.
</commit_message>
<xml_diff>
--- a/coursework/知微个人知识库需求报告.docx
+++ b/coursework/知微个人知识库需求报告.docx
@@ -36,7 +36,7 @@
           <w:sz w:val="19"/>
           <w:szCs w:val="19"/>
         </w:rPr>
-        <w:t>项目工程实践训练  专题一需求工程  V1.0</w:t>
+        <w:t>项目工程实践训练  专题一需求工程  V1.2</w:t>
       </w:r>
     </w:p>
     <w:p>
@@ -452,7 +452,7 @@
                 <w:sz w:val="21"/>
                 <w:szCs w:val="21"/>
               </w:rPr>
-              <w:t>V1.0</w:t>
+              <w:t>V1.2</w:t>
             </w:r>
           </w:p>
         </w:tc>
@@ -808,7 +808,7 @@
           <w:sz w:val="22"/>
           <w:szCs w:val="22"/>
         </w:rPr>
-        <w:t>检索增强生成是项目池要求，也是US-04的Must目标。工程已实现兼容模型接口，真实模型运行与质量验收仍待完成；当前默认TF-IDF词法检索与原文摘录是可运行的降级路径，不能据此宣称RAG生成要求已验收。</w:t>
+        <w:t>语义向量化与RAG生成均属本轮Must。ChatGPT官方会员授权已完成，gpt-6.1-sol加本地qwen3-embedding:0.6b的真实RAG检查11项通过，涵盖同义、跨文档、追问和拒答；TF-IDF与摘录仅作降级，有限样例不保证零幻觉。</w:t>
       </w:r>
     </w:p>
     <w:p>
@@ -1646,7 +1646,7 @@
           <w:sz w:val="22"/>
           <w:szCs w:val="22"/>
         </w:rPr>
-        <w:t>1. 与教师确认：RAG生成的评测题库与合格标准、是否另需语义嵌入，以及Chroma预留接口的验收方式。</w:t>
+        <w:t>1. 与教师确认：语义检索与RAG生成的评测题库、合格标准，以及Chroma预留接口的验收方式。</w:t>
       </w:r>
     </w:p>
     <w:p>
@@ -2437,7 +2437,7 @@
                 <w:sz w:val="21"/>
                 <w:szCs w:val="21"/>
               </w:rPr>
-              <w:t>批量上传PDF、Markdown和TXT并查看逐文件结果</w:t>
+              <w:t>批量上传PDF、Markdown和TXT并完成语义向量化</w:t>
             </w:r>
           </w:p>
         </w:tc>
@@ -2473,7 +2473,7 @@
                 <w:sz w:val="21"/>
                 <w:szCs w:val="21"/>
               </w:rPr>
-              <w:t>获得可检索资料</w:t>
+              <w:t>获得可检索资料及逐文件结果</w:t>
             </w:r>
           </w:p>
         </w:tc>
@@ -2509,7 +2509,7 @@
                 <w:sz w:val="21"/>
                 <w:szCs w:val="21"/>
               </w:rPr>
-              <w:t>有完整导入价值；解析、切片、索引需协作实现。</w:t>
+              <w:t>导入、切片、语义向量持久化同属Must；失败可重建。</w:t>
             </w:r>
           </w:p>
         </w:tc>
@@ -2622,7 +2622,7 @@
                 <w:sz w:val="21"/>
                 <w:szCs w:val="21"/>
               </w:rPr>
-              <w:t>对当前库提问和追问，获得由检索证据支持的生成回答及原文引用</w:t>
+              <w:t>对当前库提问和追问，获得语义检索证据支持的生成回答及原文引用</w:t>
             </w:r>
           </w:p>
         </w:tc>
@@ -2694,7 +2694,7 @@
                 <w:sz w:val="21"/>
                 <w:szCs w:val="21"/>
               </w:rPr>
-              <w:t>拆成检索、生成、引用任务；真实模型验收待完成。</w:t>
+              <w:t>语义检索与生成均必需；合成真实验收已通过。</w:t>
             </w:r>
           </w:p>
         </w:tc>
@@ -3213,7 +3213,7 @@
                 <w:sz w:val="21"/>
                 <w:szCs w:val="21"/>
               </w:rPr>
-              <w:t>后续评估Chroma和语义嵌入</w:t>
+              <w:t>后续评估Chroma的存储与检索能力</w:t>
             </w:r>
           </w:p>
         </w:tc>
@@ -3249,7 +3249,7 @@
                 <w:sz w:val="21"/>
                 <w:szCs w:val="21"/>
               </w:rPr>
-              <w:t>本期接口可测；真正升级另立迭代。</w:t>
+              <w:t>本期预留可替换接口；Chroma接入另立迭代。</w:t>
             </w:r>
           </w:p>
         </w:tc>
@@ -3357,7 +3357,7 @@
           <w:sz w:val="22"/>
           <w:szCs w:val="22"/>
         </w:rPr>
-        <w:t>以下是需求验收标准，不等于每一行已全部验证。五个Must故事均包含正常、边界和异常；生成归US-04，维护可观察性与降级增强归US-06。28项自动化测试与14项独立边界检查的覆盖及限制见第八节。</w:t>
+        <w:t>以下是需求验收标准，不等于所有输入已穷举。五个Must故事均含正常、边界和异常；语义向量化归US-03、检索生成归US-04。自动77项、边界14项、真实RAG 11项及UI 13项分开记录，限制见第八节。</w:t>
       </w:r>
     </w:p>
     <w:tbl>
@@ -4783,7 +4783,7 @@
                 <w:sz w:val="21"/>
                 <w:szCs w:val="21"/>
               </w:rPr>
-              <w:t>本人知识库可用</w:t>
+              <w:t>本人知识库可用，嵌入服务就绪</w:t>
             </w:r>
           </w:p>
         </w:tc>
@@ -4855,7 +4855,7 @@
                 <w:sz w:val="21"/>
                 <w:szCs w:val="21"/>
               </w:rPr>
-              <w:t>逐文件成功；原件可下载，片段非空并保存词项计数。</w:t>
+              <w:t>逐文件成功；原件可下载，非空片段及有限、同维语义向量持久化。</w:t>
             </w:r>
           </w:p>
         </w:tc>
@@ -5800,7 +5800,7 @@
                 <w:sz w:val="21"/>
                 <w:szCs w:val="21"/>
               </w:rPr>
-              <w:t>当前库含明确事实</w:t>
+              <w:t>当前库含明确事实，模型就绪</w:t>
             </w:r>
           </w:p>
         </w:tc>
@@ -5836,7 +5836,7 @@
                 <w:sz w:val="21"/>
                 <w:szCs w:val="21"/>
               </w:rPr>
-              <w:t>提问后用明确代词追问并打开引用</w:t>
+              <w:t>同义提问后用代词追问并打开引用</w:t>
             </w:r>
           </w:p>
         </w:tc>
@@ -5872,7 +5872,7 @@
                 <w:sz w:val="21"/>
                 <w:szCs w:val="21"/>
               </w:rPr>
-              <w:t>保留两轮记录；每条引用对应当前库真实片段，可核对原文。</w:t>
+              <w:t>语义检索当前库证据；保留两轮记录，逐字引文可核对原文。</w:t>
             </w:r>
           </w:p>
         </w:tc>
@@ -7095,7 +7095,7 @@
                 <w:sz w:val="21"/>
                 <w:szCs w:val="21"/>
               </w:rPr>
-              <w:t>密钥、地址、模型名均已配置且有证据</w:t>
+              <w:t>会员授权或API配置有效，模型就绪</w:t>
             </w:r>
           </w:p>
         </w:tc>
@@ -7131,7 +7131,7 @@
                 <w:sz w:val="21"/>
                 <w:szCs w:val="21"/>
               </w:rPr>
-              <w:t>模型返回带有效编号的回答</w:t>
+              <w:t>模型返回结构化结论、编号与引文</w:t>
             </w:r>
           </w:p>
         </w:tc>
@@ -7167,7 +7167,7 @@
                 <w:sz w:val="21"/>
                 <w:szCs w:val="21"/>
               </w:rPr>
-              <w:t>基于所给证据生成答案并标明来源；当前仅模拟验证，真实模型待验收。</w:t>
+              <w:t>校验编号及逐字原文后显示生成答案；合成真实生成验收已通过。</w:t>
             </w:r>
           </w:p>
         </w:tc>
@@ -7280,7 +7280,7 @@
                 <w:sz w:val="21"/>
                 <w:szCs w:val="21"/>
               </w:rPr>
-              <w:t>仅填密钥，地址或模型名缺失</w:t>
+              <w:t>会员未授权或在线配置不完整</w:t>
             </w:r>
           </w:p>
         </w:tc>
@@ -7352,7 +7352,7 @@
                 <w:sz w:val="21"/>
                 <w:szCs w:val="21"/>
               </w:rPr>
-              <w:t>不调用模型；提示配置不完整并回退本地摘录。</w:t>
+              <w:t>不以配置代替连接成功；显示未就绪原因并回退摘录。</w:t>
             </w:r>
           </w:p>
         </w:tc>
@@ -7465,7 +7465,7 @@
                 <w:sz w:val="21"/>
                 <w:szCs w:val="21"/>
               </w:rPr>
-              <w:t>模型已配置</w:t>
+              <w:t>已启用生成模型</w:t>
             </w:r>
           </w:p>
         </w:tc>
@@ -7501,7 +7501,7 @@
                 <w:sz w:val="21"/>
                 <w:szCs w:val="21"/>
               </w:rPr>
-              <w:t>调用超时、缺少引用或返回无效编号</w:t>
+              <w:t>流未完成、调用超时或引文不真实</w:t>
             </w:r>
           </w:p>
         </w:tc>
@@ -7537,7 +7537,7 @@
                 <w:sz w:val="21"/>
                 <w:szCs w:val="21"/>
               </w:rPr>
-              <w:t>回退本地摘录并提示原因类型；不暴露密钥和服务端错误正文。</w:t>
+              <w:t>回退摘录并提示原因；不展示未验证生成或泄露令牌。</w:t>
             </w:r>
           </w:p>
         </w:tc>
@@ -7574,7 +7574,7 @@
           <w:sz w:val="22"/>
           <w:szCs w:val="22"/>
         </w:rPr>
-        <w:t>补充一致性规则：相同内容在同库重复上传不新增片段；删除文档后不再用于新检索，历史回答可保留文字快照；删除知识库同时删除所属文档、片段、会话和上传原件。会话、文档与知识库的授权均由后端检查。</w:t>
+        <w:t>一致性规则：同库重复内容不新增片段；换嵌入模型须重建，旧向量及坏维度、NaN不可参与检索。删除文档同步删除向量，历史来源标失效；删除库清理所属资料与会话。各类资源由后端检查所有权。</w:t>
       </w:r>
     </w:p>
     <w:p>
@@ -7591,7 +7591,7 @@
           <w:sz w:val="22"/>
           <w:szCs w:val="22"/>
         </w:rPr>
-        <w:t>有效引用编号只证明来源可定位，不能证明每句话受证据支持。生成答案的事实正确性、引用是否支持具体结论，需由独立人工标注评估；不承诺绝对消除幻觉。</w:t>
+        <w:t>结构化校验要求每条结论附证据，引用编号有效且引文逐字存在于原文。它能排除伪造出处，但不能自动证明结论受证据支持；事实正确性与支持度仍需独立人工评估，不承诺绝对消除幻觉。</w:t>
       </w:r>
     </w:p>
     <w:p>
@@ -7645,7 +7645,7 @@
           <w:sz w:val="22"/>
           <w:szCs w:val="22"/>
         </w:rPr>
-        <w:t>本期定位为本地课堂工程和需求验证载体。只处理本人导入的可提取文本资料；默认不联网检索。分块后存储词项计数，问答时计算TF-IDF和余弦相似度，这是词法检索，不是语义嵌入。Chroma只有替换接口，未完成实际接入。</w:t>
+        <w:t>本期处理本人导入的可提取文本，不做联网搜索。本地Qwen3-embedding生成稠密语义向量，持久化后按余弦相似度检索；TF-IDF仅在嵌入故障时降级并明确提示。Chroma保留替换接口，尚未实际接入。</w:t>
       </w:r>
     </w:p>
     <w:tbl>
@@ -8423,7 +8423,7 @@
                 <w:sz w:val="21"/>
                 <w:szCs w:val="21"/>
               </w:rPr>
-              <w:t>模型配置缺项、超时或引用无效</w:t>
+              <w:t>嵌入故障、授权缺失或生成异常</w:t>
             </w:r>
           </w:p>
         </w:tc>
@@ -8459,7 +8459,7 @@
                 <w:sz w:val="21"/>
                 <w:szCs w:val="21"/>
               </w:rPr>
-              <w:t>明确回退到本地原文摘录；上传和历史查询继续可用。</w:t>
+              <w:t>保留原文并提示词法检索或摘录降级；允许重建向量，历史可查。</w:t>
             </w:r>
           </w:p>
         </w:tc>
@@ -8573,7 +8573,7 @@
           <w:sz w:val="22"/>
           <w:szCs w:val="22"/>
         </w:rPr>
-        <w:t>默认资料处理在本机进行。启用模型时，问题、检索片段及必要的对话上下文会提交给用户配置的服务商；需先确认资料授权。引用和文档内容均视为待核对数据，不能被当作改变系统规则的指令。数据库与上传目录没有提供文件级加密，同机操作系统权限仍是保护边界。</w:t>
+        <w:t>解析及默认嵌入在本机进行；会员生成会将问题、证据片段和必要上下文发送给ChatGPT，需确认资料授权；在线嵌入另会发送片段。资料视为待核对数据。Windows授权令牌经DPAPI加密，不返回前端；资料库及原件未做文件级加密。</w:t>
       </w:r>
     </w:p>
     <w:p>
@@ -8793,7 +8793,7 @@
                 <w:sz w:val="21"/>
                 <w:szCs w:val="21"/>
               </w:rPr>
-              <w:t>US-01至US-05：个人入口、知识库、导入、证据支持的RAG生成与溯源、历史；US-04真实模型验收待完成。</w:t>
+              <w:t>US-01至US-05：个人入口、知识库、导入及语义向量化、RAG生成与溯源、历史；核心合成验收已通过。</w:t>
             </w:r>
           </w:p>
         </w:tc>
@@ -8947,7 +8947,7 @@
                 <w:sz w:val="21"/>
                 <w:szCs w:val="21"/>
               </w:rPr>
-              <w:t>US-07：Chroma与语义嵌入升级；当前仅有可替换检索接口。</w:t>
+              <w:t>US-07：Chroma后端接入；已预留可替换接口，语义嵌入属于Must。</w:t>
             </w:r>
           </w:p>
         </w:tc>
@@ -9287,7 +9287,7 @@
                 <w:sz w:val="21"/>
                 <w:szCs w:val="21"/>
               </w:rPr>
-              <w:t>登录 → 创建库 → 上传 → 检索增强生成与追问 → 核对出处 → 重开历史；目前可演示降级路径，完整生成验收待完成。</w:t>
+              <w:t>登录 → 创建库 → 上传并语义向量化 → 检索生成与追问 → 核对出处 → 重开历史；会员授权与合成真实RAG已验证。</w:t>
             </w:r>
           </w:p>
         </w:tc>
@@ -9808,7 +9808,7 @@
                 <w:sz w:val="21"/>
                 <w:szCs w:val="21"/>
               </w:rPr>
-              <w:t>密码以带盐哈希存储；密钥不进入前端和提交记录。</w:t>
+              <w:t>密码带盐哈希；会员令牌不返回API，Windows使用DPAPI保护。</w:t>
             </w:r>
           </w:p>
         </w:tc>
@@ -9844,7 +9844,7 @@
                 <w:sz w:val="21"/>
                 <w:szCs w:val="21"/>
               </w:rPr>
-              <w:t>哈希与错误登录测试通过；发布前检查敏感文件。</w:t>
+              <w:t>真实RSA签名与DPAPI往返测试通过；OAuth远端响应为模拟。</w:t>
             </w:r>
           </w:p>
         </w:tc>
@@ -9921,7 +9921,7 @@
                 <w:sz w:val="21"/>
                 <w:szCs w:val="21"/>
               </w:rPr>
-              <w:t>测试样例中引用内容与实际片段一致；删除后不误指新文件。</w:t>
+              <w:t>每条结论绑定证据，编号及逐字引文真实；删除后不误指新文件。</w:t>
             </w:r>
           </w:p>
         </w:tc>
@@ -9957,7 +9957,7 @@
                 <w:sz w:val="21"/>
                 <w:szCs w:val="21"/>
               </w:rPr>
-              <w:t>API引用、删除及ID重用回归测试通过；事实支持度另评。</w:t>
+              <w:t>引用校验、伪造引文与删除回归通过；真实结论支持度另评。</w:t>
             </w:r>
           </w:p>
         </w:tc>
@@ -10034,7 +10034,7 @@
                 <w:sz w:val="21"/>
                 <w:szCs w:val="21"/>
               </w:rPr>
-              <w:t>重启仍可读取资料与会话，旧库升级不丢失可检索内容。</w:t>
+              <w:t>资料、会话及向量可重读；模型指纹变化须重建，不误用旧向量。</w:t>
             </w:r>
           </w:p>
         </w:tc>
@@ -10070,7 +10070,7 @@
                 <w:sz w:val="21"/>
                 <w:szCs w:val="21"/>
               </w:rPr>
-              <w:t>临时目录重建应用、旧schema迁移测试通过。</w:t>
+              <w:t>持久化、迁移、模型切换及损坏向量回归通过。</w:t>
             </w:r>
           </w:p>
         </w:tc>
@@ -10147,7 +10147,7 @@
                 <w:sz w:val="21"/>
                 <w:szCs w:val="21"/>
               </w:rPr>
-              <w:t>拟议：本地100片段数据集，预热后100次请求P95≤2秒。</w:t>
+              <w:t>拟议：100片段集，预热后100次本地检索P95≤2秒。</w:t>
             </w:r>
           </w:p>
         </w:tc>
@@ -10183,7 +10183,7 @@
                 <w:sz w:val="21"/>
                 <w:szCs w:val="21"/>
               </w:rPr>
-              <w:t>待记录硬件、资料长度与原始耗时；排除模型网络耗时。</w:t>
+              <w:t>待专项测量；冷启动嵌入29.42秒不代表此目标达成。</w:t>
             </w:r>
           </w:p>
         </w:tc>
@@ -10296,7 +10296,7 @@
                 <w:sz w:val="21"/>
                 <w:szCs w:val="21"/>
               </w:rPr>
-              <w:t>真实用户实验和完整浏览器人工验收待执行。</w:t>
+              <w:t>桌面/移动UI 13项通过；真实用户实验及完整兼容性验收待执行。</w:t>
             </w:r>
           </w:p>
         </w:tc>
@@ -10333,7 +10333,7 @@
           <w:sz w:val="22"/>
           <w:szCs w:val="22"/>
         </w:rPr>
-        <w:t>当前28项API与集成自动化测试通过，覆盖注册登录、输入错误、批量导入、PDF文本提取、账号和库隔离、引用、多轮记录、持久化、删除清理、模拟模型降级、向量接口与迁移。另有14项独立边界检查通过：10/11文件、真实20 MiB与超1字节PDF、用户名及密码长度端点、2000/2001字符问题。两套检查分开计数，均在临时目录运行且不调用真实模型。</w:t>
+        <w:t>四类证据分列：自动化77项（基础29、dense RAG 19、授权29）通过，远端响应模拟、RSA与DPAPI真实执行；独立边界14项通过；真实会员RAG 11项通过，模型为gpt-6.1-sol及qwen3-embedding:0.6b；桌面/移动UI 13项通过。真实问答仅使用新建合成库，逐字引用核对无误，验收后清理。</w:t>
       </w:r>
     </w:p>
     <w:p>
@@ -10350,7 +10350,7 @@
           <w:sz w:val="22"/>
           <w:szCs w:val="22"/>
         </w:rPr>
-        <w:t>不能由这些检查推导出所有输入已穷举、前端全部验收、模型回答正确或性能达标。独立容量检查使用合法单页PDF，账号长度检查使用ASCII字符；尚未精测200万字符、2000页及全部名称长度端点。浏览器、真实模型和用户研究分别保留独立验收记录。</w:t>
+        <w:t>真实验收含同义提问、跨两文档综合、代词追问、未知事实及诱导编造拒答，也检查空库隔离与删除失效。三条生成均为dense检索、validated回答；11项含流程检查，并非11个质量样本。用户研究、大规模正确率、性能及200万字符/2000页等仍待测。</w:t>
       </w:r>
     </w:p>
     <w:p>
@@ -10367,7 +10367,7 @@
           <w:sz w:val="22"/>
           <w:szCs w:val="22"/>
         </w:rPr>
-        <w:t>复现命令：在项目根目录用虚拟环境运行 python -m unittest discover -s tests -v；独立边界检查运行 python tools/check_boundaries.py。28项与14项分别记录，数量以提交版本实际输出为准；整套测试耗时不是单次问答性能指标。</w:t>
+        <w:t>复现：python -m unittest discover -s tests -v；边界：python tools/check_boundaries.py。77/14/11/13四套记录不合并为unittest。嵌入单例1024维、相关/无关余弦0.742/0.307另记；冷启动29.42秒及单次问答耗时不证明P95达标。</w:t>
       </w:r>
     </w:p>
     <w:p>
@@ -11742,7 +11742,7 @@
                 <w:sz w:val="21"/>
                 <w:szCs w:val="21"/>
               </w:rPr>
-              <w:t>用户要求完成项目2，并同意推荐的Python后端和网页前端。</w:t>
+              <w:t>用户确认Python后端与网页前端；本轮选择ChatGPT会员登录加本地嵌入。</w:t>
             </w:r>
           </w:p>
         </w:tc>
@@ -11778,7 +11778,7 @@
                 <w:sz w:val="21"/>
                 <w:szCs w:val="21"/>
               </w:rPr>
-              <w:t>用户已确认技术选择。</w:t>
+              <w:t>技术路线已确认，官方会员授权已完成。</w:t>
             </w:r>
           </w:p>
         </w:tc>
@@ -11891,7 +11891,7 @@
                 <w:sz w:val="21"/>
                 <w:szCs w:val="21"/>
               </w:rPr>
-              <w:t>提交版本代码、28项自动化测试及14项独立边界检查。</w:t>
+              <w:t>代码、自动77项、边界14项、真实RAG 11项及UI 13项记录。</w:t>
             </w:r>
           </w:p>
         </w:tc>
@@ -11927,7 +11927,7 @@
                 <w:sz w:val="21"/>
                 <w:szCs w:val="21"/>
               </w:rPr>
-              <w:t>工程证据；不代替用户需求访谈。</w:t>
+              <w:t>工程及合成实测；不代替真实用户访谈与总体效果评估。</w:t>
             </w:r>
           </w:p>
         </w:tc>

</xml_diff>

<commit_message>
Switch default RAG generation to DeepSeek API
Keep embeddings local, isolate provider credentials, and show missing-key setup guidance. Add 9 DeepSeek contract regressions and update course materials to V1.3 with real API acceptance explicitly pending.
</commit_message>
<xml_diff>
--- a/coursework/知微个人知识库需求报告.docx
+++ b/coursework/知微个人知识库需求报告.docx
@@ -36,7 +36,7 @@
           <w:sz w:val="19"/>
           <w:szCs w:val="19"/>
         </w:rPr>
-        <w:t>项目工程实践训练  专题一需求工程  V1.2</w:t>
+        <w:t>项目工程实践训练  专题一需求工程  V1.3</w:t>
       </w:r>
     </w:p>
     <w:p>
@@ -452,7 +452,7 @@
                 <w:sz w:val="21"/>
                 <w:szCs w:val="21"/>
               </w:rPr>
-              <w:t>V1.2</w:t>
+              <w:t>V1.3</w:t>
             </w:r>
           </w:p>
         </w:tc>
@@ -808,7 +808,7 @@
           <w:sz w:val="22"/>
           <w:szCs w:val="22"/>
         </w:rPr>
-        <w:t>语义向量化与RAG生成均属本轮Must。ChatGPT官方会员授权已完成，gpt-6.1-sol加本地qwen3-embedding:0.6b的真实RAG检查11项通过，涵盖同义、跨文档、追问和拒答；TF-IDF与摘录仅作降级，有限样例不保证零幻觉。</w:t>
+        <w:t>语义向量化与RAG生成均属Must。当前默认DeepSeek API（deepseek-flash）加本地qwen3-embedding:0.6b；密钥待本地填写，DeepSeek真实验收待完成。此前ChatGPT会员11项属历史证据，不计为DeepSeek通过；TF-IDF与摘录仅作降级。</w:t>
       </w:r>
     </w:p>
     <w:p>
@@ -2694,7 +2694,7 @@
                 <w:sz w:val="21"/>
                 <w:szCs w:val="21"/>
               </w:rPr>
-              <w:t>语义检索与生成均必需；合成真实验收已通过。</w:t>
+              <w:t>语义检索与生成均必需；DeepSeek真实验收待密钥。</w:t>
             </w:r>
           </w:p>
         </w:tc>
@@ -3357,7 +3357,7 @@
           <w:sz w:val="22"/>
           <w:szCs w:val="22"/>
         </w:rPr>
-        <w:t>以下是需求验收标准，不等于所有输入已穷举。五个Must故事均含正常、边界和异常；语义向量化归US-03、检索生成归US-04。自动77项、边界14项、真实RAG 11项及UI 13项分开记录，限制见第八节。</w:t>
+        <w:t>以下是需求验收标准，不等于所有输入已穷举。五个Must均含正常、边界和异常；语义向量化归US-03、检索生成归US-04。自动86项与历史边界14项、会员RAG 11项、旧版UI 13项分开记录，DeepSeek真实验收待补。</w:t>
       </w:r>
     </w:p>
     <w:tbl>
@@ -7095,7 +7095,7 @@
                 <w:sz w:val="21"/>
                 <w:szCs w:val="21"/>
               </w:rPr>
-              <w:t>会员授权或API配置有效，模型就绪</w:t>
+              <w:t>DeepSeek密钥、地址和模型有效</w:t>
             </w:r>
           </w:p>
         </w:tc>
@@ -7167,7 +7167,7 @@
                 <w:sz w:val="21"/>
                 <w:szCs w:val="21"/>
               </w:rPr>
-              <w:t>校验编号及逐字原文后显示生成答案；合成真实生成验收已通过。</w:t>
+              <w:t>校验编号及逐字原文后显示生成答案；DeepSeek真实调用待验收。</w:t>
             </w:r>
           </w:p>
         </w:tc>
@@ -7280,7 +7280,7 @@
                 <w:sz w:val="21"/>
                 <w:szCs w:val="21"/>
               </w:rPr>
-              <w:t>会员未授权或在线配置不完整</w:t>
+              <w:t>DeepSeek密钥未填或在线配置不完整</w:t>
             </w:r>
           </w:p>
         </w:tc>
@@ -7501,7 +7501,7 @@
                 <w:sz w:val="21"/>
                 <w:szCs w:val="21"/>
               </w:rPr>
-              <w:t>流未完成、调用超时或引文不真实</w:t>
+              <w:t>响应不完整、调用超时或引文不真实</w:t>
             </w:r>
           </w:p>
         </w:tc>
@@ -8573,7 +8573,7 @@
           <w:sz w:val="22"/>
           <w:szCs w:val="22"/>
         </w:rPr>
-        <w:t>解析及默认嵌入在本机进行；会员生成会将问题、证据片段和必要上下文发送给ChatGPT，需确认资料授权；在线嵌入另会发送片段。资料视为待核对数据。Windows授权令牌经DPAPI加密，不返回前端；资料库及原件未做文件级加密。</w:t>
+        <w:t>解析及默认嵌入在本机进行；DeepSeek生成会发送问题、检索片段和必要上下文，需确认资料授权。密钥只填本地.env的DEEPSEEK_API_KEY，不返回前端或提交Git；资料库及原件未加密。可选会员令牌的DPAPI保护不适用于.env密钥。</w:t>
       </w:r>
     </w:p>
     <w:p>
@@ -8793,7 +8793,7 @@
                 <w:sz w:val="21"/>
                 <w:szCs w:val="21"/>
               </w:rPr>
-              <w:t>US-01至US-05：个人入口、知识库、导入及语义向量化、RAG生成与溯源、历史；核心合成验收已通过。</w:t>
+              <w:t>US-01至US-05：个人入口、知识库、导入及语义向量化、RAG生成与溯源、历史；当前DeepSeek真实验收待密钥。</w:t>
             </w:r>
           </w:p>
         </w:tc>
@@ -9287,7 +9287,7 @@
                 <w:sz w:val="21"/>
                 <w:szCs w:val="21"/>
               </w:rPr>
-              <w:t>登录 → 创建库 → 上传并语义向量化 → 检索生成与追问 → 核对出处 → 重开历史；会员授权与合成真实RAG已验证。</w:t>
+              <w:t>登录 → 创建库 → 上传并语义向量化 → 检索生成与追问 → 核对出处 → 重开历史；当前DeepSeek密钥待填，真实闭环待验收。</w:t>
             </w:r>
           </w:p>
         </w:tc>
@@ -9808,7 +9808,7 @@
                 <w:sz w:val="21"/>
                 <w:szCs w:val="21"/>
               </w:rPr>
-              <w:t>密码带盐哈希；会员令牌不返回API，Windows使用DPAPI保护。</w:t>
+              <w:t>密码带盐哈希；API密钥仅本地配置，不返回前端或提交Git。</w:t>
             </w:r>
           </w:p>
         </w:tc>
@@ -9844,7 +9844,7 @@
                 <w:sz w:val="21"/>
                 <w:szCs w:val="21"/>
               </w:rPr>
-              <w:t>真实RSA签名与DPAPI往返测试通过；OAuth远端响应为模拟。</w:t>
+              <w:t>敏感信息回归；历史会员另有真实RSA和DPAPI验证。</w:t>
             </w:r>
           </w:p>
         </w:tc>
@@ -10296,7 +10296,7 @@
                 <w:sz w:val="21"/>
                 <w:szCs w:val="21"/>
               </w:rPr>
-              <w:t>桌面/移动UI 13项通过；真实用户实验及完整兼容性验收待执行。</w:t>
+              <w:t>旧版桌面/移动UI 13项通过；本轮界面及真实用户实验另验。</w:t>
             </w:r>
           </w:p>
         </w:tc>
@@ -10333,7 +10333,7 @@
           <w:sz w:val="22"/>
           <w:szCs w:val="22"/>
         </w:rPr>
-        <w:t>四类证据分列：自动化77项（基础29、dense RAG 19、授权29）通过，远端响应模拟、RSA与DPAPI真实执行；独立边界14项通过；真实会员RAG 11项通过，模型为gpt-6.1-sol及qwen3-embedding:0.6b；桌面/移动UI 13项通过。真实问答仅使用新建合成库，逐字引用核对无误，验收后清理。</w:t>
+        <w:t>证据分列：当前自动化86项通过，远端响应模拟、RSA与DPAPI真实执行；本轮DeepSeek适配以模拟回归验证，真实密钥未填。保留历史边界14项、会员RAG 11项及旧版UI 13项；会员模型为gpt-6.1-sol及本地qwen3-embedding:0.6b，合成库已清理，不能据此判定DeepSeek通过。</w:t>
       </w:r>
     </w:p>
     <w:p>
@@ -10350,7 +10350,7 @@
           <w:sz w:val="22"/>
           <w:szCs w:val="22"/>
         </w:rPr>
-        <w:t>真实验收含同义提问、跨两文档综合、代词追问、未知事实及诱导编造拒答，也检查空库隔离与删除失效。三条生成均为dense检索、validated回答；11项含流程检查，并非11个质量样本。用户研究、大规模正确率、性能及200万字符/2000页等仍待测。</w:t>
+        <w:t>历史会员验收含同义、跨两文档、代词追问、未知及诱导编造拒答，也检查空库隔离与删除失效。三条生成均为dense、validated；11项含流程检查，并非11个质量样本。当前DeepSeek需单独重验；真人研究、总体正确率、性能及复杂边界仍待测。</w:t>
       </w:r>
     </w:p>
     <w:p>
@@ -10367,7 +10367,7 @@
           <w:sz w:val="22"/>
           <w:szCs w:val="22"/>
         </w:rPr>
-        <w:t>复现：python -m unittest discover -s tests -v；边界：python tools/check_boundaries.py。77/14/11/13四套记录不合并为unittest。嵌入单例1024维、相关/无关余弦0.742/0.307另记；冷启动29.42秒及单次问答耗时不证明P95达标。</w:t>
+        <w:t>复现：python -m unittest discover -s tests -v；边界：python tools/check_boundaries.py。自动86项与历史14/11/13分开记录。嵌入单例1024维、相关/无关余弦0.742/0.307另记；冷启动29.42秒不证明P95达标，也不验证生成模型。</w:t>
       </w:r>
     </w:p>
     <w:p>
@@ -11742,7 +11742,7 @@
                 <w:sz w:val="21"/>
                 <w:szCs w:val="21"/>
               </w:rPr>
-              <w:t>用户确认Python后端与网页前端；本轮选择ChatGPT会员登录加本地嵌入。</w:t>
+              <w:t>用户确认Python与网页方案；本轮改为DeepSeek API加本地嵌入。</w:t>
             </w:r>
           </w:p>
         </w:tc>
@@ -11778,7 +11778,7 @@
                 <w:sz w:val="21"/>
                 <w:szCs w:val="21"/>
               </w:rPr>
-              <w:t>技术路线已确认，官方会员授权已完成。</w:t>
+              <w:t>默认路线已确认，API密钥待用户本地申请填写。</w:t>
             </w:r>
           </w:p>
         </w:tc>
@@ -11891,7 +11891,7 @@
                 <w:sz w:val="21"/>
                 <w:szCs w:val="21"/>
               </w:rPr>
-              <w:t>代码、自动77项、边界14项、真实RAG 11项及UI 13项记录。</w:t>
+              <w:t>代码与模拟回归；历史边界14项、会员RAG 11项及UI 13项。</w:t>
             </w:r>
           </w:p>
         </w:tc>
@@ -11927,7 +11927,7 @@
                 <w:sz w:val="21"/>
                 <w:szCs w:val="21"/>
               </w:rPr>
-              <w:t>工程及合成实测；不代替真实用户访谈与总体效果评估。</w:t>
+              <w:t>证据按提供方和版本区分；不替代当前DeepSeek真实验收。</w:t>
             </w:r>
           </w:p>
         </w:tc>

</xml_diff>